<commit_message>
docs: atualiza relatorios e organiza entrega
</commit_message>
<xml_diff>
--- a/relatorio/Relatorio_PD_LiftHero_A3.docx
+++ b/relatorio/Relatorio_PD_LiftHero_A3.docx
@@ -2172,17 +2172,8 @@
             <w:vAlign w:val="center"/>
           </w:tcPr>
           <w:p>
-            <w:pPr>
-              <w:spacing w:after="0"/>
-            </w:pPr>
-            <w:r/>
             <w:r>
-              <w:rPr>
-                <w:rFonts w:ascii="Calibri" w:hAnsi="Calibri"/>
-                <w:b w:val="0"/>
-                <w:sz w:val="20"/>
-              </w:rPr>
-              <w:t>Atendido com melhoria recomendada</w:t>
+              <w:t>Atendido</w:t>
             </w:r>
           </w:p>
         </w:tc>
@@ -2192,17 +2183,8 @@
             <w:vAlign w:val="center"/>
           </w:tcPr>
           <w:p>
-            <w:pPr>
-              <w:spacing w:after="0"/>
-            </w:pPr>
-            <w:r/>
             <w:r>
-              <w:rPr>
-                <w:rFonts w:ascii="Calibri" w:hAnsi="Calibri"/>
-                <w:b w:val="0"/>
-                <w:sz w:val="20"/>
-              </w:rPr>
-              <w:t>Tags presentes no head; recomenda-se PNG/JPG absoluto para WhatsApp.</w:t>
+              <w:t>Imagem PNG absoluta 1200x630, metadados og:url/og:image e Twitter Card.</w:t>
             </w:r>
           </w:p>
         </w:tc>
@@ -3141,6 +3123,7 @@
         <w:t>evidencias/evidencia-mobile-ux.png</w:t>
       </w:r>
     </w:p>
+    <CT_P/>
     <w:p>
       <w:r>
         <w:br w:type="page"/>
@@ -3236,7 +3219,7 @@
           <w:i w:val="0"/>
           <w:sz w:val="22"/>
         </w:rPr>
-        <w:t>Substituir a imagem Open Graph atual por PNG/JPG 1200x630 com URL absoluta para melhorar preview em WhatsApp e redes sociais.</w:t>
+        <w:t>Validar periodicamente o cache de pré-visualização social em WhatsApp, LinkedIn e outros canais após novas publicações.</w:t>
       </w:r>
     </w:p>
     <w:p>
@@ -3266,7 +3249,7 @@
           <w:i w:val="0"/>
           <w:sz w:val="22"/>
         </w:rPr>
-        <w:t>Evoluir a identidade visual com logo própria e imagem social final.</w:t>
+        <w:t>Manter consistência da identidade visual final nos próximos materiais de apresentação, README e eventuais telas futuras.</w:t>
       </w:r>
     </w:p>
     <w:p>
@@ -3342,7 +3325,7 @@
           <w:i w:val="0"/>
           <w:sz w:val="22"/>
         </w:rPr>
-        <w:t>A validação técnica mostra que o projeto está apto para a auditoria da A3: possui deploy público, repositório documentado, integração de dados via LocalStorage, feedback visual, prevenção de erros, responsividade e nota Lighthouse de acessibilidade superior ao exigido. A principal melhoria recomendada antes da apresentação final é a troca do Open Graph para uma imagem PNG/JPG absoluta, fortalecendo o critério de compartilhamento social.</w:t>
+        <w:t>A validação técnica mostra que o projeto está apto para a auditoria da A3: possui deploy público, repositório documentado, integração de dados via LocalStorage, feedback visual, prevenção de erros, responsividade, nota Lighthouse de acessibilidade superior ao exigido e tags Open Graph com imagem PNG absoluta. As melhorias futuras mais relevantes são exportação/importação de dados, testes automatizados e evolução para uma API real quando houver necessidade de sincronização entre dispositivos.</w:t>
       </w:r>
     </w:p>
     <w:p>

</xml_diff>

<commit_message>
docs: remove lista redundante de evidencias
</commit_message>
<xml_diff>
--- a/relatorio/Relatorio_PD_LiftHero_A3.docx
+++ b/relatorio/Relatorio_PD_LiftHero_A3.docx
@@ -223,11 +223,6 @@
           <w:sz w:val="22"/>
         </w:rPr>
         <w:t>2026</w:t>
-      </w:r>
-    </w:p>
-    <w:p>
-      <w:r>
-        <w:br w:type="page"/>
       </w:r>
     </w:p>
     <w:p>
@@ -3032,97 +3027,6 @@
         <w:t>Figura 3 - Evidência de teste mobile, touch targets e ausência de overflow horizontal.</w:t>
       </w:r>
     </w:p>
-    <w:p>
-      <w:pPr>
-        <w:pStyle w:val="Heading2"/>
-        <w:spacing w:before="160" w:after="120"/>
-      </w:pPr>
-      <w:r>
-        <w:rPr>
-          <w:rFonts w:ascii="Calibri" w:hAnsi="Calibri"/>
-          <w:b/>
-          <w:i w:val="0"/>
-          <w:color w:val="1F4D78"/>
-          <w:sz w:val="26"/>
-        </w:rPr>
-        <w:t>4.3 Arquivos de evidência salvos</w:t>
-      </w:r>
-    </w:p>
-    <w:p>
-      <w:pPr>
-        <w:pStyle w:val="ListBullet"/>
-        <w:spacing w:after="60" w:line="264" w:lineRule="auto"/>
-      </w:pPr>
-      <w:r>
-        <w:rPr>
-          <w:rFonts w:ascii="Calibri" w:hAnsi="Calibri"/>
-          <w:b w:val="0"/>
-          <w:i w:val="0"/>
-          <w:sz w:val="22"/>
-        </w:rPr>
-        <w:t>evidencias/lighthouse-lifthero-accessibility.report.html</w:t>
-      </w:r>
-    </w:p>
-    <w:p>
-      <w:pPr>
-        <w:pStyle w:val="ListBullet"/>
-        <w:spacing w:after="60" w:line="264" w:lineRule="auto"/>
-      </w:pPr>
-      <w:r>
-        <w:rPr>
-          <w:rFonts w:ascii="Calibri" w:hAnsi="Calibri"/>
-          <w:b w:val="0"/>
-          <w:i w:val="0"/>
-          <w:sz w:val="22"/>
-        </w:rPr>
-        <w:t>evidencias/lighthouse-lifthero-accessibility.report.json</w:t>
-      </w:r>
-    </w:p>
-    <w:p>
-      <w:pPr>
-        <w:pStyle w:val="ListBullet"/>
-        <w:spacing w:after="60" w:line="264" w:lineRule="auto"/>
-      </w:pPr>
-      <w:r>
-        <w:rPr>
-          <w:rFonts w:ascii="Calibri" w:hAnsi="Calibri"/>
-          <w:b w:val="0"/>
-          <w:i w:val="0"/>
-          <w:sz w:val="22"/>
-        </w:rPr>
-        <w:t>evidencias/evidencia-lighthouse-score.png</w:t>
-      </w:r>
-    </w:p>
-    <w:p>
-      <w:pPr>
-        <w:pStyle w:val="ListBullet"/>
-        <w:spacing w:after="60" w:line="264" w:lineRule="auto"/>
-      </w:pPr>
-      <w:r>
-        <w:rPr>
-          <w:rFonts w:ascii="Calibri" w:hAnsi="Calibri"/>
-          <w:b w:val="0"/>
-          <w:i w:val="0"/>
-          <w:sz w:val="22"/>
-        </w:rPr>
-        <w:t>evidencias/evidencia-deploy-render.png</w:t>
-      </w:r>
-    </w:p>
-    <w:p>
-      <w:pPr>
-        <w:pStyle w:val="ListBullet"/>
-        <w:spacing w:after="60" w:line="264" w:lineRule="auto"/>
-      </w:pPr>
-      <w:r>
-        <w:rPr>
-          <w:rFonts w:ascii="Calibri" w:hAnsi="Calibri"/>
-          <w:b w:val="0"/>
-          <w:i w:val="0"/>
-          <w:sz w:val="22"/>
-        </w:rPr>
-        <w:t>evidencias/evidencia-mobile-ux.png</w:t>
-      </w:r>
-    </w:p>
     <CT_P/>
     <w:p>
       <w:r>

</xml_diff>